<commit_message>
updae PROSPERO  ammendment for major revision, add other screening methods screening fils and second emailto co author
</commit_message>
<xml_diff>
--- a/review/protocol_amended/PROSPERO PROTOCOL_v2_amended_Oct2026.docx
+++ b/review/protocol_amended/PROSPERO PROTOCOL_v2_amended_Oct2026.docx
@@ -92,7 +92,7 @@
           <w14:ligatures w14:val="none"/>
           <w:highlight w:val="yellow"/>
         </w:rPr>
-        <w:t>Version 2 (amendment submitted October 2026, before formal screening began). Changes:</w:t>
+        <w:t>Version 2 (amendment submitted October/November 2026, after the second reviewer completed independent title/abstract screening and before the first reviewer's screening; no screening decisions had been compared). Changes:</w:t>
       </w:r>
     </w:p>
     <w:p>
@@ -176,7 +176,7 @@
           <w14:ligatures w14:val="none"/>
           <w:highlight w:val="yellow"/>
         </w:rPr>
-        <w:t>3. Review team: Adeika Ebenezer Adeiza joins as second independent reviewer (screening, extraction checking, quality assessment, writing). Dr. Onyema Osuagwu continues as supervisor and adjudicates unresolved full-text disagreements.</w:t>
+        <w:t>3. Review team: Ebenezer Adeiza Adeika joins as co-author and second independent reviewer (screening, extraction checking, quality assessment, drafting and revising manuscript sections). Dr. Onyema Osuagwu continues as supervisor and adjudicates unresolved full-text disagreements.</w:t>
       </w:r>
     </w:p>
     <w:p>
@@ -232,7 +232,7 @@
           <w14:ligatures w14:val="none"/>
           <w:highlight w:val="yellow"/>
         </w:rPr>
-        <w:t>5. Anticipated completion date revised to 30 October 2026.</w:t>
+        <w:t>5. Other methods: records identified through citation searching and hand-searching are screened as a separate stream and reported in the PRISMA 2020 "other methods" column.</w:t>
       </w:r>
     </w:p>
     <w:p>
@@ -260,6 +260,34 @@
           <w14:ligatures w14:val="none"/>
           <w:highlight w:val="yellow"/>
         </w:rPr>
+        <w:t>6. Anticipated completion date revised to 30 November 2026.</w:t>
+      </w:r>
+    </w:p>
+    <w:p>
+      <w:pPr>
+        <w:spacing w:before="100" w:beforeAutospacing="1" w:after="100" w:afterAutospacing="1" w:line="240" w:lineRule="auto"/>
+        <w:outlineLvl w:val="0"/>
+        <w:rPr>
+          <w:rFonts w:ascii="Candara" w:eastAsia="Times New Roman" w:hAnsi="Candara" w:cs="Times New Roman"/>
+          <w:b/>
+          <w:bCs/>
+          <w:kern w:val="36"/>
+          <w:sz w:val="48"/>
+          <w:szCs w:val="48"/>
+          <w14:ligatures w14:val="none"/>
+        </w:rPr>
+      </w:pPr>
+      <w:r>
+        <w:rPr>
+          <w:rFonts w:ascii="Candara" w:eastAsia="Times New Roman" w:hAnsi="Candara" w:cs="Times New Roman"/>
+          <w:b w:val="0"/>
+          <w:bCs/>
+          <w:kern w:val="36"/>
+          <w:sz w:val="48"/>
+          <w:szCs w:val="48"/>
+          <w14:ligatures w14:val="none"/>
+          <w:highlight w:val="yellow"/>
+        </w:rPr>
         <w:t>All amended text in this document is highlighted.</w:t>
       </w:r>
     </w:p>
@@ -572,7 +600,7 @@
           <w14:ligatures w14:val="none"/>
           <w:highlight w:val="yellow"/>
         </w:rPr>
-        <w:t>30 October 2026 (amended October 2026; originally 31 July 2026)</w:t>
+        <w:t>30 November 2026 (amended; originally 31 July 2026)</w:t>
       </w:r>
     </w:p>
     <w:p>
@@ -682,7 +710,7 @@
           <w14:ligatures w14:val="none"/>
           <w:highlight w:val="yellow"/>
         </w:rPr>
-        <w:t>Named contact and first reviewer: Blessing Isoyiza Adeika (Department of Electrical and Computer Engineering, Morgan State University). Second independent reviewer: Adeika Ebenezer Adeiza (BSc Psychology, University of Ilorin; Department of Internal Medicine, Federal Teaching Hospital, Gombe, Nigeria). Supervisor: Dr. Onyema Osuagwu (Morgan State University).</w:t>
+        <w:t>Named contact and first reviewer: Blessing Isoyiza Adeika (Department of Electrical and Computer Engineering, Morgan State University). Co-author and second independent reviewer: Ebenezer Adeiza Adeika (BSc Psychology, University of Ilorin; Department of Internal Medicine, Federal Teaching Hospital, Gombe, Nigeria). Supervisor: Dr. Onyema Osuagwu (Morgan State University).</w:t>
       </w:r>
     </w:p>
     <w:p>
@@ -5592,7 +5620,7 @@
           <w14:ligatures w14:val="none"/>
           <w:highlight w:val="yellow"/>
         </w:rPr>
-        <w:t>Stage 1 — Title and abstract screening: All records retrieved from database searches are screened independently by two reviewers (B.I.A. and A.E.A.), each blinded to the other's decisions, using a standardised screening workbook with pre-specified exclusion reasons. A pilot set of 30 randomly selected records is screened first to calibrate the reviewers; pilot records are excluded from the agreement statistics. Records are classified as Include, Exclude, or Uncertain, and any record marked Include or Uncertain by either reviewer proceeds to full-text assessment. (Amended October 2026.)</w:t>
+        <w:t>Stage 1 — Title and abstract screening: All records retrieved from database searches are screened independently by two reviewers (B.I.A. and E.A.A.), each blinded to the other's decisions, using a standardised screening workbook with pre-specified exclusion reasons. Each reviewer screens a pilot set of 30 randomly selected records before their main screening; pilot decisions are then compared to calibrate the reviewers. The second reviewer completed the pilot and main screening before this calibration; the first reviewer's main screening follows it. Main-screening decisions are not revised after calibration, and pilot records are excluded from the agreement statistics. Records are classified as Include, Exclude, or Uncertain, and any record marked Include or Uncertain by either reviewer proceeds to full-text assessment. (Amended October 2026.)</w:t>
       </w:r>
     </w:p>
     <w:p>
@@ -5930,7 +5958,7 @@
           <w14:ligatures w14:val="none"/>
           <w:highlight w:val="yellow"/>
         </w:rPr>
-        <w:t>Data extraction is performed by B.I.A. and independently cross-checked against the source publications by A.E.A. Discrepancies are resolved through discussion until consensus is reached. (Amended October 2026.)</w:t>
+        <w:t>Data extraction is performed by B.I.A. and independently cross-checked against the source publications by E.A.A. Discrepancies are resolved through discussion until consensus is reached. (Amended October 2026.)</w:t>
       </w:r>
     </w:p>
     <w:p>
@@ -6337,7 +6365,7 @@
           <w14:ligatures w14:val="none"/>
           <w:highlight w:val="yellow"/>
         </w:rPr>
-        <w:t>Quality assessment is performed independently by two reviewers (B.I.A. and A.E.A.), with disagreements resolved through discussion and unresolved cases referred to the supervising author (O.O.). (Amended October 2026.)</w:t>
+        <w:t>Quality assessment is performed independently by two reviewers (B.I.A. and E.A.A.), with disagreements resolved through discussion and unresolved cases referred to the supervising author (O.O.). (Amended October 2026.)</w:t>
       </w:r>
     </w:p>
     <w:p>
@@ -8520,7 +8548,7 @@
           <w14:ligatures w14:val="none"/>
           <w:highlight w:val="yellow"/>
         </w:rPr>
-        <w:t>Formal screening of retrieved records: Not yet started (status at amendment, October 2026; formal searches completed 13 April 2026 and re-executed 1 October 2026)</w:t>
+        <w:t>Formal screening of retrieved records: Started (status at amendment: second reviewer completed title/abstract screening; first reviewer not started; no decisions compared; formal searches completed 13 April 2026 and re-executed 1 October 2026)</w:t>
       </w:r>
     </w:p>
     <w:p>
@@ -9013,7 +9041,7 @@
         <w:rPr>
           <w:highlight w:val="yellow"/>
         </w:rPr>
-        <w:t xml:space="preserve"> [Amendment, October 2026: searches executed on 13 April 2026 were re-executed on 1 October 2026 after the exports were lost; Web of Science was not searched; a second independent reviewer (A.E.A.) has joined; peripheral-signal (sEMG) studies are excluded.]</w:t>
+        <w:t xml:space="preserve"> [Amendment, October 2026: searches executed on 13 April 2026 were re-executed on 1 October 2026 after the exports were lost; Web of Science was not searched; a second independent reviewer (E.A.A.) has joined; peripheral-signal (sEMG) studies are excluded.]</w:t>
       </w:r>
     </w:p>
     <w:p>
@@ -9082,7 +9110,7 @@
         <w:rPr>
           <w:highlight w:val="yellow"/>
         </w:rPr>
-        <w:t xml:space="preserve"> [Amendment, October 2026: searches executed on 13 April 2026 were re-executed on 1 October 2026 after the exports were lost; Web of Science was not searched; a second independent reviewer (A.E.A.) has joined; peripheral-signal (sEMG) studies are excluded.]</w:t>
+        <w:t xml:space="preserve"> [Amendment, October 2026: searches executed on 13 April 2026 were re-executed on 1 October 2026 after the exports were lost; Web of Science was not searched; a second independent reviewer (E.A.A.) has joined; peripheral-signal (sEMG) studies are excluded.]</w:t>
       </w:r>
     </w:p>
     <w:p>

</xml_diff>